<commit_message>
git hub pages link
</commit_message>
<xml_diff>
--- a/lab01/lab01_report.docx
+++ b/lab01/lab01_report.docx
@@ -128,93 +128,149 @@
         </w:rPr>
         <w:t xml:space="preserve">Репозиторий: </w:t>
       </w:r>
-      <w:r>
-        <w:t>https</w:t>
-      </w:r>
-      <w:r>
-        <w:rPr>
-          <w:lang w:val="ru-RU"/>
-        </w:rPr>
-        <w:t>://</w:t>
-      </w:r>
-      <w:r>
-        <w:t>github</w:t>
-      </w:r>
-      <w:r>
-        <w:rPr>
-          <w:lang w:val="ru-RU"/>
-        </w:rPr>
-        <w:t>.</w:t>
-      </w:r>
-      <w:r>
-        <w:t>com</w:t>
-      </w:r>
-      <w:r>
-        <w:rPr>
-          <w:lang w:val="ru-RU"/>
-        </w:rPr>
-        <w:t>/</w:t>
-      </w:r>
-      <w:r>
-        <w:t>SarkArt</w:t>
-      </w:r>
-      <w:r>
-        <w:rPr>
-          <w:lang w:val="ru-RU"/>
-        </w:rPr>
-        <w:t>314/</w:t>
-      </w:r>
-      <w:r>
-        <w:t>KG</w:t>
-      </w:r>
+      <w:hyperlink r:id="rId6" w:history="1">
+        <w:r>
+          <w:rPr>
+            <w:rStyle w:val="aff8"/>
+          </w:rPr>
+          <w:t>https</w:t>
+        </w:r>
+        <w:r>
+          <w:rPr>
+            <w:rStyle w:val="aff8"/>
+            <w:lang w:val="ru-RU"/>
+          </w:rPr>
+          <w:t>://</w:t>
+        </w:r>
+        <w:r>
+          <w:rPr>
+            <w:rStyle w:val="aff8"/>
+          </w:rPr>
+          <w:t>github</w:t>
+        </w:r>
+        <w:r>
+          <w:rPr>
+            <w:rStyle w:val="aff8"/>
+            <w:lang w:val="ru-RU"/>
+          </w:rPr>
+          <w:t>.</w:t>
+        </w:r>
+        <w:r>
+          <w:rPr>
+            <w:rStyle w:val="aff8"/>
+          </w:rPr>
+          <w:t>com</w:t>
+        </w:r>
+        <w:r>
+          <w:rPr>
+            <w:rStyle w:val="aff8"/>
+            <w:lang w:val="ru-RU"/>
+          </w:rPr>
+          <w:t>/</w:t>
+        </w:r>
+        <w:r>
+          <w:rPr>
+            <w:rStyle w:val="aff8"/>
+          </w:rPr>
+          <w:t>SarkArt</w:t>
+        </w:r>
+        <w:r>
+          <w:rPr>
+            <w:rStyle w:val="aff8"/>
+            <w:lang w:val="ru-RU"/>
+          </w:rPr>
+          <w:t>314/</w:t>
+        </w:r>
+        <w:r>
+          <w:rPr>
+            <w:rStyle w:val="aff8"/>
+          </w:rPr>
+          <w:t>KG</w:t>
+        </w:r>
+      </w:hyperlink>
     </w:p>
     <w:p>
       <w:pPr>
-        <w:pStyle w:val="1"/>
-      </w:pPr>
-      <w:r>
-        <w:t>1. Цель работы</w:t>
+        <w:rPr>
+          <w:lang w:val="ru-RU"/>
+        </w:rPr>
+      </w:pPr>
+      <w:r>
+        <w:t>Github</w:t>
+      </w:r>
+      <w:r>
+        <w:rPr>
+          <w:lang w:val="ru-RU"/>
+        </w:rPr>
+        <w:t xml:space="preserve"> </w:t>
+      </w:r>
+      <w:r>
+        <w:t>pages</w:t>
+      </w:r>
+      <w:r>
+        <w:rPr>
+          <w:lang w:val="ru-RU"/>
+        </w:rPr>
+        <w:t xml:space="preserve">: </w:t>
+      </w:r>
+      <w:r>
+        <w:t>https</w:t>
+      </w:r>
+      <w:r>
+        <w:rPr>
+          <w:lang w:val="ru-RU"/>
+        </w:rPr>
+        <w:t>://</w:t>
+      </w:r>
+      <w:r>
+        <w:t>sarkart</w:t>
+      </w:r>
+      <w:r>
+        <w:rPr>
+          <w:lang w:val="ru-RU"/>
+        </w:rPr>
+        <w:t>314.</w:t>
+      </w:r>
+      <w:r>
+        <w:t>github</w:t>
+      </w:r>
+      <w:r>
+        <w:rPr>
+          <w:lang w:val="ru-RU"/>
+        </w:rPr>
+        <w:t>.</w:t>
+      </w:r>
+      <w:r>
+        <w:t>io</w:t>
+      </w:r>
+      <w:r>
+        <w:rPr>
+          <w:lang w:val="ru-RU"/>
+        </w:rPr>
+        <w:t>/</w:t>
+      </w:r>
+      <w:r>
+        <w:t>KG</w:t>
+      </w:r>
+      <w:r>
+        <w:rPr>
+          <w:lang w:val="ru-RU"/>
+        </w:rPr>
+        <w:t>/</w:t>
       </w:r>
     </w:p>
     <w:p>
       <w:pPr>
-        <w:pStyle w:val="a0"/>
-        <w:rPr>
-          <w:lang w:val="ru-RU"/>
-        </w:rPr>
-      </w:pPr>
-      <w:r>
-        <w:rPr>
-          <w:lang w:val="ru-RU"/>
-        </w:rPr>
-        <w:t xml:space="preserve">Изучить основные цветовые модели: </w:t>
-      </w:r>
-      <w:r>
-        <w:t>RGB</w:t>
-      </w:r>
-      <w:r>
-        <w:rPr>
-          <w:lang w:val="ru-RU"/>
-        </w:rPr>
-        <w:t xml:space="preserve">, </w:t>
-      </w:r>
-      <w:r>
-        <w:t>CMYK</w:t>
-      </w:r>
-      <w:r>
-        <w:rPr>
-          <w:lang w:val="ru-RU"/>
-        </w:rPr>
-        <w:t xml:space="preserve"> и </w:t>
-      </w:r>
-      <w:r>
-        <w:t>HSV</w:t>
-      </w:r>
-      <w:r>
-        <w:rPr>
-          <w:lang w:val="ru-RU"/>
-        </w:rPr>
-        <w:t>.</w:t>
+        <w:pStyle w:val="1"/>
+        <w:rPr>
+          <w:lang w:val="ru-RU"/>
+        </w:rPr>
+      </w:pPr>
+      <w:r>
+        <w:rPr>
+          <w:lang w:val="ru-RU"/>
+        </w:rPr>
+        <w:t>1. Цель работы</w:t>
       </w:r>
     </w:p>
     <w:p>
@@ -228,7 +284,34 @@
         <w:rPr>
           <w:lang w:val="ru-RU"/>
         </w:rPr>
-        <w:t>Разобраться в принципах преобразования между цветовыми моделями.</w:t>
+        <w:t xml:space="preserve">Изучить основные цветовые модели: </w:t>
+      </w:r>
+      <w:r>
+        <w:t>RGB</w:t>
+      </w:r>
+      <w:r>
+        <w:rPr>
+          <w:lang w:val="ru-RU"/>
+        </w:rPr>
+        <w:t xml:space="preserve">, </w:t>
+      </w:r>
+      <w:r>
+        <w:t>CMYK</w:t>
+      </w:r>
+      <w:r>
+        <w:rPr>
+          <w:lang w:val="ru-RU"/>
+        </w:rPr>
+        <w:t xml:space="preserve"> и </w:t>
+      </w:r>
+      <w:r>
+        <w:t>HSV</w:t>
+      </w:r>
+      <w:r>
+        <w:rPr>
+          <w:lang w:val="ru-RU"/>
+        </w:rPr>
+        <w:t>.</w:t>
       </w:r>
     </w:p>
     <w:p>
@@ -242,7 +325,7 @@
         <w:rPr>
           <w:lang w:val="ru-RU"/>
         </w:rPr>
-        <w:t>Реализовать программное приложение, позволяющее интерактивно изменять цвет.</w:t>
+        <w:t>Разобраться в принципах преобразования между цветовыми моделями.</w:t>
       </w:r>
     </w:p>
     <w:p>
@@ -256,73 +339,64 @@
         <w:rPr>
           <w:lang w:val="ru-RU"/>
         </w:rPr>
-        <w:t xml:space="preserve">Обеспечить автоматический пересчёт цвета между тремя моделями: </w:t>
-      </w:r>
-      <w:r>
-        <w:t>CMYK</w:t>
-      </w:r>
-      <w:r>
-        <w:rPr>
-          <w:lang w:val="ru-RU"/>
-        </w:rPr>
-        <w:t xml:space="preserve">, </w:t>
-      </w:r>
-      <w:r>
-        <w:t>RGB</w:t>
-      </w:r>
-      <w:r>
-        <w:rPr>
-          <w:lang w:val="ru-RU"/>
-        </w:rPr>
-        <w:t xml:space="preserve"> и </w:t>
-      </w:r>
-      <w:r>
-        <w:t>HSV</w:t>
-      </w:r>
-      <w:r>
-        <w:rPr>
-          <w:lang w:val="ru-RU"/>
-        </w:rPr>
-        <w:t>.</w:t>
+        <w:t>Реализовать программное приложение, позволяющее интерактивно изменять цвет.</w:t>
       </w:r>
     </w:p>
     <w:p>
       <w:pPr>
-        <w:pStyle w:val="1"/>
-      </w:pPr>
-      <w:r>
-        <w:t>2. Ход работы</w:t>
+        <w:pStyle w:val="a0"/>
+        <w:rPr>
+          <w:lang w:val="ru-RU"/>
+        </w:rPr>
+      </w:pPr>
+      <w:r>
+        <w:rPr>
+          <w:lang w:val="ru-RU"/>
+        </w:rPr>
+        <w:t xml:space="preserve">Обеспечить автоматический пересчёт цвета между тремя моделями: </w:t>
+      </w:r>
+      <w:r>
+        <w:t>CMYK</w:t>
+      </w:r>
+      <w:r>
+        <w:rPr>
+          <w:lang w:val="ru-RU"/>
+        </w:rPr>
+        <w:t xml:space="preserve">, </w:t>
+      </w:r>
+      <w:r>
+        <w:t>RGB</w:t>
+      </w:r>
+      <w:r>
+        <w:rPr>
+          <w:lang w:val="ru-RU"/>
+        </w:rPr>
+        <w:t xml:space="preserve"> и </w:t>
+      </w:r>
+      <w:r>
+        <w:t>HSV</w:t>
+      </w:r>
+      <w:r>
+        <w:rPr>
+          <w:lang w:val="ru-RU"/>
+        </w:rPr>
+        <w:t>.</w:t>
       </w:r>
     </w:p>
     <w:p>
       <w:pPr>
-        <w:pStyle w:val="21"/>
-      </w:pPr>
-      <w:r>
-        <w:t>2.1. Что изучалось</w:t>
+        <w:pStyle w:val="1"/>
+      </w:pPr>
+      <w:r>
+        <w:t>2. Ход работы</w:t>
       </w:r>
     </w:p>
     <w:p>
       <w:pPr>
-        <w:pStyle w:val="a0"/>
-        <w:rPr>
-          <w:lang w:val="ru-RU"/>
-        </w:rPr>
-      </w:pPr>
-      <w:r>
-        <w:rPr>
-          <w:lang w:val="ru-RU"/>
-        </w:rPr>
-        <w:t xml:space="preserve">Аддитивная цветовая модель </w:t>
-      </w:r>
-      <w:r>
-        <w:t>RGB</w:t>
-      </w:r>
-      <w:r>
-        <w:rPr>
-          <w:lang w:val="ru-RU"/>
-        </w:rPr>
-        <w:t>, используемая для отображения цвета на экранах.</w:t>
+        <w:pStyle w:val="21"/>
+      </w:pPr>
+      <w:r>
+        <w:t>2.1. Что изучалось</w:t>
       </w:r>
     </w:p>
     <w:p>
@@ -336,16 +410,16 @@
         <w:rPr>
           <w:lang w:val="ru-RU"/>
         </w:rPr>
-        <w:t xml:space="preserve">Субтрактивная цветовая модель </w:t>
-      </w:r>
-      <w:r>
-        <w:t>CMYK</w:t>
-      </w:r>
-      <w:r>
-        <w:rPr>
-          <w:lang w:val="ru-RU"/>
-        </w:rPr>
-        <w:t>, используемая для печати.</w:t>
+        <w:t xml:space="preserve">Аддитивная цветовая модель </w:t>
+      </w:r>
+      <w:r>
+        <w:t>RGB</w:t>
+      </w:r>
+      <w:r>
+        <w:rPr>
+          <w:lang w:val="ru-RU"/>
+        </w:rPr>
+        <w:t>, используемая для отображения цвета на экранах.</w:t>
       </w:r>
     </w:p>
     <w:p>
@@ -359,16 +433,16 @@
         <w:rPr>
           <w:lang w:val="ru-RU"/>
         </w:rPr>
-        <w:t xml:space="preserve">Модель </w:t>
-      </w:r>
-      <w:r>
-        <w:t>HSV</w:t>
-      </w:r>
-      <w:r>
-        <w:rPr>
-          <w:lang w:val="ru-RU"/>
-        </w:rPr>
-        <w:t>, представляющая цвет в виде тона, насыщенности и яркости.</w:t>
+        <w:t xml:space="preserve">Субтрактивная цветовая модель </w:t>
+      </w:r>
+      <w:r>
+        <w:t>CMYK</w:t>
+      </w:r>
+      <w:r>
+        <w:rPr>
+          <w:lang w:val="ru-RU"/>
+        </w:rPr>
+        <w:t>, используемая для печати.</w:t>
       </w:r>
     </w:p>
     <w:p>
@@ -382,43 +456,16 @@
         <w:rPr>
           <w:lang w:val="ru-RU"/>
         </w:rPr>
-        <w:t xml:space="preserve">Алгоритмы преобразования </w:t>
-      </w:r>
-      <w:r>
-        <w:t>RGB</w:t>
-      </w:r>
-      <w:r>
-        <w:rPr>
-          <w:lang w:val="ru-RU"/>
-        </w:rPr>
-        <w:t xml:space="preserve"> → </w:t>
-      </w:r>
-      <w:r>
-        <w:t>CMYK</w:t>
-      </w:r>
-      <w:r>
-        <w:rPr>
-          <w:lang w:val="ru-RU"/>
-        </w:rPr>
-        <w:t xml:space="preserve">, </w:t>
-      </w:r>
-      <w:r>
-        <w:t>CMYK</w:t>
-      </w:r>
-      <w:r>
-        <w:rPr>
-          <w:lang w:val="ru-RU"/>
-        </w:rPr>
-        <w:t xml:space="preserve"> → </w:t>
-      </w:r>
-      <w:r>
-        <w:t>RGB</w:t>
-      </w:r>
-      <w:r>
-        <w:rPr>
-          <w:lang w:val="ru-RU"/>
-        </w:rPr>
-        <w:t>.</w:t>
+        <w:t xml:space="preserve">Модель </w:t>
+      </w:r>
+      <w:r>
+        <w:t>HSV</w:t>
+      </w:r>
+      <w:r>
+        <w:rPr>
+          <w:lang w:val="ru-RU"/>
+        </w:rPr>
+        <w:t>, представляющая цвет в виде тона, насыщенности и яркости.</w:t>
       </w:r>
     </w:p>
     <w:p>
@@ -444,7 +491,7 @@
         <w:t xml:space="preserve"> → </w:t>
       </w:r>
       <w:r>
-        <w:t>HSV</w:t>
+        <w:t>CMYK</w:t>
       </w:r>
       <w:r>
         <w:rPr>
@@ -453,7 +500,7 @@
         <w:t xml:space="preserve">, </w:t>
       </w:r>
       <w:r>
-        <w:t>HSV</w:t>
+        <w:t>CMYK</w:t>
       </w:r>
       <w:r>
         <w:rPr>
@@ -482,64 +529,114 @@
         <w:rPr>
           <w:lang w:val="ru-RU"/>
         </w:rPr>
-        <w:t>Особенности взаимной неоднозначности цветовых преобразований.</w:t>
+        <w:t xml:space="preserve">Алгоритмы преобразования </w:t>
+      </w:r>
+      <w:r>
+        <w:t>RGB</w:t>
+      </w:r>
+      <w:r>
+        <w:rPr>
+          <w:lang w:val="ru-RU"/>
+        </w:rPr>
+        <w:t xml:space="preserve"> → </w:t>
+      </w:r>
+      <w:r>
+        <w:t>HSV</w:t>
+      </w:r>
+      <w:r>
+        <w:rPr>
+          <w:lang w:val="ru-RU"/>
+        </w:rPr>
+        <w:t xml:space="preserve">, </w:t>
+      </w:r>
+      <w:r>
+        <w:t>HSV</w:t>
+      </w:r>
+      <w:r>
+        <w:rPr>
+          <w:lang w:val="ru-RU"/>
+        </w:rPr>
+        <w:t xml:space="preserve"> → </w:t>
+      </w:r>
+      <w:r>
+        <w:t>RGB</w:t>
+      </w:r>
+      <w:r>
+        <w:rPr>
+          <w:lang w:val="ru-RU"/>
+        </w:rPr>
+        <w:t>.</w:t>
       </w:r>
     </w:p>
     <w:p>
       <w:pPr>
-        <w:pStyle w:val="21"/>
-        <w:rPr>
-          <w:lang w:val="ru-RU"/>
-        </w:rPr>
-      </w:pPr>
-      <w:r>
-        <w:rPr>
-          <w:lang w:val="ru-RU"/>
-        </w:rPr>
-        <w:t>2.2. Основные формулы</w:t>
+        <w:pStyle w:val="a0"/>
+        <w:rPr>
+          <w:lang w:val="ru-RU"/>
+        </w:rPr>
+      </w:pPr>
+      <w:r>
+        <w:rPr>
+          <w:lang w:val="ru-RU"/>
+        </w:rPr>
+        <w:t>Особенности взаимной неоднозначности цветовых преобразований.</w:t>
       </w:r>
     </w:p>
     <w:p>
       <w:pPr>
-        <w:rPr>
-          <w:lang w:val="ru-RU"/>
-        </w:rPr>
-      </w:pPr>
-      <w:r>
-        <w:rPr>
-          <w:lang w:val="ru-RU"/>
-        </w:rPr>
-        <w:t xml:space="preserve">В работе использовались стандартные формулы преобразования цветовых моделей. Во всех формулах предполагается, что значения </w:t>
-      </w:r>
-      <w:r>
-        <w:t>RGB</w:t>
-      </w:r>
-      <w:r>
-        <w:rPr>
-          <w:lang w:val="ru-RU"/>
-        </w:rPr>
-        <w:t xml:space="preserve"> нормированы в диапазон от 0 до 1.</w:t>
+        <w:pStyle w:val="21"/>
+        <w:rPr>
+          <w:lang w:val="ru-RU"/>
+        </w:rPr>
+      </w:pPr>
+      <w:r>
+        <w:rPr>
+          <w:lang w:val="ru-RU"/>
+        </w:rPr>
+        <w:t>2.2. Основные формулы</w:t>
       </w:r>
     </w:p>
     <w:p>
       <w:pPr>
-        <w:pStyle w:val="31"/>
-        <w:rPr>
-          <w:lang w:val="ru-RU"/>
-        </w:rPr>
-      </w:pPr>
-      <w:r>
-        <w:rPr>
-          <w:lang w:val="ru-RU"/>
-        </w:rPr>
-        <w:t xml:space="preserve">Нормировка </w:t>
+        <w:rPr>
+          <w:lang w:val="ru-RU"/>
+        </w:rPr>
+      </w:pPr>
+      <w:r>
+        <w:rPr>
+          <w:lang w:val="ru-RU"/>
+        </w:rPr>
+        <w:t xml:space="preserve">В работе использовались стандартные формулы преобразования цветовых моделей. Во всех формулах предполагается, что значения </w:t>
       </w:r>
       <w:r>
         <w:t>RGB</w:t>
+      </w:r>
+      <w:r>
+        <w:rPr>
+          <w:lang w:val="ru-RU"/>
+        </w:rPr>
+        <w:t xml:space="preserve"> нормированы в диапазон от 0 до 1.</w:t>
       </w:r>
     </w:p>
     <w:p>
       <w:pPr>
+        <w:pStyle w:val="31"/>
+        <w:rPr>
+          <w:lang w:val="ru-RU"/>
+        </w:rPr>
+      </w:pPr>
+      <w:r>
+        <w:rPr>
+          <w:lang w:val="ru-RU"/>
+        </w:rPr>
+        <w:t xml:space="preserve">Нормировка </w:t>
+      </w:r>
+      <w:r>
+        <w:t>RGB</w:t>
+      </w:r>
+    </w:p>
+    <w:p>
+      <w:pPr>
         <w:spacing w:after="40"/>
         <w:ind w:left="360"/>
         <w:rPr>
@@ -590,6 +687,7 @@
           <w:rFonts w:ascii="Consolas" w:hAnsi="Consolas"/>
           <w:sz w:val="20"/>
         </w:rPr>
+        <w:lastRenderedPageBreak/>
         <w:t>G</w:t>
       </w:r>
       <w:r>
@@ -663,7 +761,6 @@
         </w:rPr>
       </w:pPr>
       <w:r>
-        <w:lastRenderedPageBreak/>
         <w:t>RGB</w:t>
       </w:r>
       <w:r>
@@ -695,7 +792,6 @@
         </w:rPr>
         <w:t xml:space="preserve"> = 1 - </w:t>
       </w:r>
-      <w:proofErr w:type="gramStart"/>
       <w:r>
         <w:rPr>
           <w:rFonts w:ascii="Consolas" w:hAnsi="Consolas"/>
@@ -710,7 +806,6 @@
         </w:rPr>
         <w:t>(</w:t>
       </w:r>
-      <w:proofErr w:type="gramEnd"/>
       <w:r>
         <w:rPr>
           <w:rFonts w:ascii="Consolas" w:hAnsi="Consolas"/>
@@ -831,6 +926,11 @@
       </w:r>
     </w:p>
     <w:p>
+      <w:pPr>
+        <w:rPr>
+          <w:lang w:val="ru-RU"/>
+        </w:rPr>
+      </w:pPr>
       <w:r>
         <w:rPr>
           <w:lang w:val="ru-RU"/>
@@ -1243,60 +1343,161 @@
           <w:rFonts w:ascii="Consolas" w:hAnsi="Consolas"/>
           <w:sz w:val="20"/>
         </w:rPr>
-        <w:t xml:space="preserve">V = </w:t>
-      </w:r>
-      <w:proofErr w:type="gramStart"/>
+        <w:t>V = max(R', G', B')</w:t>
+      </w:r>
+    </w:p>
+    <w:p>
+      <w:pPr>
+        <w:spacing w:after="40"/>
+        <w:ind w:left="360"/>
+      </w:pPr>
       <w:r>
         <w:rPr>
           <w:rFonts w:ascii="Consolas" w:hAnsi="Consolas"/>
           <w:sz w:val="20"/>
         </w:rPr>
-        <w:t>max(</w:t>
-      </w:r>
-      <w:proofErr w:type="gramEnd"/>
+        <w:t>min = min(R', G', B')</w:t>
+      </w:r>
+    </w:p>
+    <w:p>
+      <w:pPr>
+        <w:spacing w:after="40"/>
+        <w:ind w:left="360"/>
+        <w:rPr>
+          <w:lang w:val="ru-RU"/>
+        </w:rPr>
+      </w:pPr>
       <w:r>
         <w:rPr>
           <w:rFonts w:ascii="Consolas" w:hAnsi="Consolas"/>
           <w:sz w:val="20"/>
         </w:rPr>
-        <w:t>R', G', B')</w:t>
+        <w:t>delta</w:t>
+      </w:r>
+      <w:r>
+        <w:rPr>
+          <w:rFonts w:ascii="Consolas" w:hAnsi="Consolas"/>
+          <w:sz w:val="20"/>
+          <w:lang w:val="ru-RU"/>
+        </w:rPr>
+        <w:t xml:space="preserve"> = </w:t>
+      </w:r>
+      <w:r>
+        <w:rPr>
+          <w:rFonts w:ascii="Consolas" w:hAnsi="Consolas"/>
+          <w:sz w:val="20"/>
+        </w:rPr>
+        <w:t>V</w:t>
+      </w:r>
+      <w:r>
+        <w:rPr>
+          <w:rFonts w:ascii="Consolas" w:hAnsi="Consolas"/>
+          <w:sz w:val="20"/>
+          <w:lang w:val="ru-RU"/>
+        </w:rPr>
+        <w:t xml:space="preserve"> - </w:t>
+      </w:r>
+      <w:r>
+        <w:rPr>
+          <w:rFonts w:ascii="Consolas" w:hAnsi="Consolas"/>
+          <w:sz w:val="20"/>
+        </w:rPr>
+        <w:t>min</w:t>
       </w:r>
     </w:p>
     <w:p>
       <w:pPr>
+        <w:rPr>
+          <w:lang w:val="ru-RU"/>
+        </w:rPr>
+      </w:pPr>
+      <w:r>
+        <w:rPr>
+          <w:lang w:val="ru-RU"/>
+        </w:rPr>
+        <w:t>Насыщенность:</w:t>
+      </w:r>
+    </w:p>
+    <w:p>
+      <w:pPr>
         <w:spacing w:after="40"/>
         <w:ind w:left="360"/>
+        <w:rPr>
+          <w:lang w:val="ru-RU"/>
+        </w:rPr>
       </w:pPr>
       <w:r>
         <w:rPr>
           <w:rFonts w:ascii="Consolas" w:hAnsi="Consolas"/>
           <w:sz w:val="20"/>
         </w:rPr>
-        <w:t>min = min(R', G', B')</w:t>
+        <w:t>S</w:t>
+      </w:r>
+      <w:r>
+        <w:rPr>
+          <w:rFonts w:ascii="Consolas" w:hAnsi="Consolas"/>
+          <w:sz w:val="20"/>
+          <w:lang w:val="ru-RU"/>
+        </w:rPr>
+        <w:t xml:space="preserve"> = 0, если </w:t>
+      </w:r>
+      <w:r>
+        <w:rPr>
+          <w:rFonts w:ascii="Consolas" w:hAnsi="Consolas"/>
+          <w:sz w:val="20"/>
+        </w:rPr>
+        <w:t>V</w:t>
+      </w:r>
+      <w:r>
+        <w:rPr>
+          <w:rFonts w:ascii="Consolas" w:hAnsi="Consolas"/>
+          <w:sz w:val="20"/>
+          <w:lang w:val="ru-RU"/>
+        </w:rPr>
+        <w:t xml:space="preserve"> = 0</w:t>
       </w:r>
     </w:p>
     <w:p>
       <w:pPr>
         <w:spacing w:after="40"/>
         <w:ind w:left="360"/>
-        <w:rPr>
-          <w:lang w:val="ru-RU"/>
-        </w:rPr>
       </w:pPr>
       <w:r>
         <w:rPr>
           <w:rFonts w:ascii="Consolas" w:hAnsi="Consolas"/>
           <w:sz w:val="20"/>
         </w:rPr>
-        <w:t>delta</w:t>
-      </w:r>
+        <w:t>S = delta / V, если V ≠ 0</w:t>
+      </w:r>
+    </w:p>
+    <w:p>
+      <w:pPr>
+        <w:rPr>
+          <w:lang w:val="ru-RU"/>
+        </w:rPr>
+      </w:pPr>
+      <w:r>
+        <w:rPr>
+          <w:lang w:val="ru-RU"/>
+        </w:rPr>
+        <w:t>Тон цвета:</w:t>
+      </w:r>
+    </w:p>
+    <w:p>
+      <w:pPr>
+        <w:spacing w:after="40"/>
+        <w:ind w:left="360"/>
+        <w:rPr>
+          <w:lang w:val="ru-RU"/>
+        </w:rPr>
+      </w:pPr>
       <w:r>
         <w:rPr>
           <w:rFonts w:ascii="Consolas" w:hAnsi="Consolas"/>
           <w:sz w:val="20"/>
           <w:lang w:val="ru-RU"/>
         </w:rPr>
-        <w:t xml:space="preserve"> = </w:t>
+        <w:t xml:space="preserve">Если </w:t>
       </w:r>
       <w:r>
         <w:rPr>
@@ -1311,66 +1512,176 @@
           <w:sz w:val="20"/>
           <w:lang w:val="ru-RU"/>
         </w:rPr>
-        <w:t xml:space="preserve"> - </w:t>
+        <w:t xml:space="preserve"> = 0 или </w:t>
       </w:r>
       <w:r>
         <w:rPr>
           <w:rFonts w:ascii="Consolas" w:hAnsi="Consolas"/>
           <w:sz w:val="20"/>
         </w:rPr>
-        <w:t>min</w:t>
+        <w:t>delta</w:t>
+      </w:r>
+      <w:r>
+        <w:rPr>
+          <w:rFonts w:ascii="Consolas" w:hAnsi="Consolas"/>
+          <w:sz w:val="20"/>
+          <w:lang w:val="ru-RU"/>
+        </w:rPr>
+        <w:t xml:space="preserve"> = 0, то </w:t>
+      </w:r>
+      <w:r>
+        <w:rPr>
+          <w:rFonts w:ascii="Consolas" w:hAnsi="Consolas"/>
+          <w:sz w:val="20"/>
+        </w:rPr>
+        <w:t>H</w:t>
+      </w:r>
+      <w:r>
+        <w:rPr>
+          <w:rFonts w:ascii="Consolas" w:hAnsi="Consolas"/>
+          <w:sz w:val="20"/>
+          <w:lang w:val="ru-RU"/>
+        </w:rPr>
+        <w:t xml:space="preserve"> = 0</w:t>
       </w:r>
     </w:p>
     <w:p>
       <w:pPr>
-        <w:rPr>
-          <w:lang w:val="ru-RU"/>
-        </w:rPr>
-      </w:pPr>
-      <w:r>
-        <w:rPr>
-          <w:lang w:val="ru-RU"/>
-        </w:rPr>
-        <w:t>Насыщенность:</w:t>
+        <w:spacing w:after="40"/>
+        <w:ind w:left="360"/>
+      </w:pPr>
+      <w:r>
+        <w:rPr>
+          <w:rFonts w:ascii="Consolas" w:hAnsi="Consolas"/>
+          <w:sz w:val="20"/>
+        </w:rPr>
+        <w:t>Если max = R', то H = 60 × (((G' - B') / delta) mod 6)</w:t>
       </w:r>
     </w:p>
     <w:p>
       <w:pPr>
         <w:spacing w:after="40"/>
         <w:ind w:left="360"/>
-        <w:rPr>
-          <w:lang w:val="ru-RU"/>
-        </w:rPr>
       </w:pPr>
       <w:r>
         <w:rPr>
           <w:rFonts w:ascii="Consolas" w:hAnsi="Consolas"/>
           <w:sz w:val="20"/>
         </w:rPr>
-        <w:t>S</w:t>
-      </w:r>
+        <w:t>Если max = G', то H = 60 × (((B' - R') / delta) + 2)</w:t>
+      </w:r>
+    </w:p>
+    <w:p>
+      <w:pPr>
+        <w:spacing w:after="40"/>
+        <w:ind w:left="360"/>
+      </w:pPr>
       <w:r>
         <w:rPr>
           <w:rFonts w:ascii="Consolas" w:hAnsi="Consolas"/>
           <w:sz w:val="20"/>
-          <w:lang w:val="ru-RU"/>
-        </w:rPr>
-        <w:t xml:space="preserve"> = 0, если </w:t>
-      </w:r>
+        </w:rPr>
+        <w:t>Если max = B', то H = 60 × (((R' - G') / delta) + 4)</w:t>
+      </w:r>
+    </w:p>
+    <w:p>
+      <w:pPr>
+        <w:rPr>
+          <w:lang w:val="ru-RU"/>
+        </w:rPr>
+      </w:pPr>
+      <w:r>
+        <w:rPr>
+          <w:lang w:val="ru-RU"/>
+        </w:rPr>
+        <w:t xml:space="preserve">Если </w:t>
+      </w:r>
+      <w:r>
+        <w:t>H</w:t>
+      </w:r>
+      <w:r>
+        <w:rPr>
+          <w:lang w:val="ru-RU"/>
+        </w:rPr>
+        <w:t xml:space="preserve"> оказывается отрицательным, к нему добавляется 360, чтобы значение находилось в диапазоне от 0 до 360.</w:t>
+      </w:r>
+    </w:p>
+    <w:p>
+      <w:pPr>
+        <w:pStyle w:val="31"/>
+        <w:rPr>
+          <w:lang w:val="ru-RU"/>
+        </w:rPr>
+      </w:pPr>
+      <w:r>
+        <w:t>HSV</w:t>
+      </w:r>
+      <w:r>
+        <w:rPr>
+          <w:lang w:val="ru-RU"/>
+        </w:rPr>
+        <w:t xml:space="preserve"> → </w:t>
+      </w:r>
+      <w:r>
+        <w:t>RGB</w:t>
+      </w:r>
+    </w:p>
+    <w:p>
+      <w:pPr>
+        <w:rPr>
+          <w:lang w:val="ru-RU"/>
+        </w:rPr>
+      </w:pPr>
+      <w:r>
+        <w:rPr>
+          <w:lang w:val="ru-RU"/>
+        </w:rPr>
+        <w:t xml:space="preserve">Значения </w:t>
+      </w:r>
+      <w:r>
+        <w:t>S</w:t>
+      </w:r>
+      <w:r>
+        <w:rPr>
+          <w:lang w:val="ru-RU"/>
+        </w:rPr>
+        <w:t xml:space="preserve"> и </w:t>
+      </w:r>
+      <w:r>
+        <w:t>V</w:t>
+      </w:r>
+      <w:r>
+        <w:rPr>
+          <w:lang w:val="ru-RU"/>
+        </w:rPr>
+        <w:t xml:space="preserve"> переводятся из процентов в доли от 0 до 1.</w:t>
+      </w:r>
+    </w:p>
+    <w:p>
+      <w:pPr>
+        <w:spacing w:after="40"/>
+        <w:ind w:left="360"/>
+      </w:pPr>
       <w:r>
         <w:rPr>
           <w:rFonts w:ascii="Consolas" w:hAnsi="Consolas"/>
           <w:sz w:val="20"/>
         </w:rPr>
-        <w:t>V</w:t>
-      </w:r>
+        <w:t>C = V × S</w:t>
+      </w:r>
+    </w:p>
+    <w:p>
+      <w:pPr>
+        <w:spacing w:after="40"/>
+        <w:ind w:left="360"/>
+      </w:pPr>
       <w:r>
         <w:rPr>
           <w:rFonts w:ascii="Consolas" w:hAnsi="Consolas"/>
           <w:sz w:val="20"/>
-          <w:lang w:val="ru-RU"/>
-        </w:rPr>
-        <w:t xml:space="preserve"> = 0</w:t>
+        </w:rPr>
+        <w:lastRenderedPageBreak/>
+        <w:t>X = C × (1 - |((H / 60) mod 2) - 1|)</w:t>
       </w:r>
     </w:p>
     <w:p>
@@ -1383,7 +1694,7 @@
           <w:rFonts w:ascii="Consolas" w:hAnsi="Consolas"/>
           <w:sz w:val="20"/>
         </w:rPr>
-        <w:t>S = delta / V, если V ≠ 0</w:t>
+        <w:t>m = V - C</w:t>
       </w:r>
     </w:p>
     <w:p>
@@ -1396,7 +1707,43 @@
         <w:rPr>
           <w:lang w:val="ru-RU"/>
         </w:rPr>
-        <w:t>Тон цвета:</w:t>
+        <w:t xml:space="preserve">В зависимости от значения </w:t>
+      </w:r>
+      <w:r>
+        <w:t>H</w:t>
+      </w:r>
+      <w:r>
+        <w:rPr>
+          <w:lang w:val="ru-RU"/>
+        </w:rPr>
+        <w:t xml:space="preserve"> выбирается один из шести секторов, после чего определяются промежуточные значения </w:t>
+      </w:r>
+      <w:r>
+        <w:t>R</w:t>
+      </w:r>
+      <w:r>
+        <w:rPr>
+          <w:lang w:val="ru-RU"/>
+        </w:rPr>
+        <w:t xml:space="preserve">1, </w:t>
+      </w:r>
+      <w:r>
+        <w:t>G</w:t>
+      </w:r>
+      <w:r>
+        <w:rPr>
+          <w:lang w:val="ru-RU"/>
+        </w:rPr>
+        <w:t xml:space="preserve">1, </w:t>
+      </w:r>
+      <w:r>
+        <w:t>B</w:t>
+      </w:r>
+      <w:r>
+        <w:rPr>
+          <w:lang w:val="ru-RU"/>
+        </w:rPr>
+        <w:t>1.</w:t>
       </w:r>
     </w:p>
     <w:p>
@@ -1411,454 +1758,191 @@
         <w:rPr>
           <w:rFonts w:ascii="Consolas" w:hAnsi="Consolas"/>
           <w:sz w:val="20"/>
-          <w:lang w:val="ru-RU"/>
-        </w:rPr>
-        <w:t xml:space="preserve">Если </w:t>
+        </w:rPr>
+        <w:t>R</w:t>
       </w:r>
       <w:r>
         <w:rPr>
           <w:rFonts w:ascii="Consolas" w:hAnsi="Consolas"/>
           <w:sz w:val="20"/>
-        </w:rPr>
-        <w:t>V</w:t>
+          <w:lang w:val="ru-RU"/>
+        </w:rPr>
+        <w:t xml:space="preserve"> = 255 × (</w:t>
       </w:r>
       <w:r>
         <w:rPr>
           <w:rFonts w:ascii="Consolas" w:hAnsi="Consolas"/>
           <w:sz w:val="20"/>
-          <w:lang w:val="ru-RU"/>
-        </w:rPr>
-        <w:t xml:space="preserve"> = 0 или </w:t>
+        </w:rPr>
+        <w:t>R</w:t>
       </w:r>
       <w:r>
         <w:rPr>
           <w:rFonts w:ascii="Consolas" w:hAnsi="Consolas"/>
           <w:sz w:val="20"/>
-        </w:rPr>
-        <w:t>delta</w:t>
+          <w:lang w:val="ru-RU"/>
+        </w:rPr>
+        <w:t xml:space="preserve">1 + </w:t>
       </w:r>
       <w:r>
         <w:rPr>
           <w:rFonts w:ascii="Consolas" w:hAnsi="Consolas"/>
           <w:sz w:val="20"/>
-          <w:lang w:val="ru-RU"/>
-        </w:rPr>
-        <w:t xml:space="preserve"> = 0, то </w:t>
+        </w:rPr>
+        <w:t>m</w:t>
       </w:r>
       <w:r>
         <w:rPr>
           <w:rFonts w:ascii="Consolas" w:hAnsi="Consolas"/>
           <w:sz w:val="20"/>
-        </w:rPr>
-        <w:t>H</w:t>
-      </w:r>
+          <w:lang w:val="ru-RU"/>
+        </w:rPr>
+        <w:t>)</w:t>
+      </w:r>
+    </w:p>
+    <w:p>
+      <w:pPr>
+        <w:spacing w:after="40"/>
+        <w:ind w:left="360"/>
+        <w:rPr>
+          <w:lang w:val="ru-RU"/>
+        </w:rPr>
+      </w:pPr>
       <w:r>
         <w:rPr>
           <w:rFonts w:ascii="Consolas" w:hAnsi="Consolas"/>
           <w:sz w:val="20"/>
-          <w:lang w:val="ru-RU"/>
-        </w:rPr>
-        <w:t xml:space="preserve"> = 0</w:t>
+        </w:rPr>
+        <w:t>G</w:t>
+      </w:r>
+      <w:r>
+        <w:rPr>
+          <w:rFonts w:ascii="Consolas" w:hAnsi="Consolas"/>
+          <w:sz w:val="20"/>
+          <w:lang w:val="ru-RU"/>
+        </w:rPr>
+        <w:t xml:space="preserve"> = 255 × (</w:t>
+      </w:r>
+      <w:r>
+        <w:rPr>
+          <w:rFonts w:ascii="Consolas" w:hAnsi="Consolas"/>
+          <w:sz w:val="20"/>
+        </w:rPr>
+        <w:t>G</w:t>
+      </w:r>
+      <w:r>
+        <w:rPr>
+          <w:rFonts w:ascii="Consolas" w:hAnsi="Consolas"/>
+          <w:sz w:val="20"/>
+          <w:lang w:val="ru-RU"/>
+        </w:rPr>
+        <w:t xml:space="preserve">1 + </w:t>
+      </w:r>
+      <w:r>
+        <w:rPr>
+          <w:rFonts w:ascii="Consolas" w:hAnsi="Consolas"/>
+          <w:sz w:val="20"/>
+        </w:rPr>
+        <w:t>m</w:t>
+      </w:r>
+      <w:r>
+        <w:rPr>
+          <w:rFonts w:ascii="Consolas" w:hAnsi="Consolas"/>
+          <w:sz w:val="20"/>
+          <w:lang w:val="ru-RU"/>
+        </w:rPr>
+        <w:t>)</w:t>
       </w:r>
     </w:p>
     <w:p>
       <w:pPr>
         <w:spacing w:after="40"/>
         <w:ind w:left="360"/>
+        <w:rPr>
+          <w:lang w:val="ru-RU"/>
+        </w:rPr>
       </w:pPr>
       <w:r>
         <w:rPr>
           <w:rFonts w:ascii="Consolas" w:hAnsi="Consolas"/>
           <w:sz w:val="20"/>
         </w:rPr>
-        <w:t>Если max = R', то H = 60 × (((G' - B') / delta) mod 6)</w:t>
+        <w:t>B</w:t>
+      </w:r>
+      <w:r>
+        <w:rPr>
+          <w:rFonts w:ascii="Consolas" w:hAnsi="Consolas"/>
+          <w:sz w:val="20"/>
+          <w:lang w:val="ru-RU"/>
+        </w:rPr>
+        <w:t xml:space="preserve"> = 255 × (</w:t>
+      </w:r>
+      <w:r>
+        <w:rPr>
+          <w:rFonts w:ascii="Consolas" w:hAnsi="Consolas"/>
+          <w:sz w:val="20"/>
+        </w:rPr>
+        <w:t>B</w:t>
+      </w:r>
+      <w:r>
+        <w:rPr>
+          <w:rFonts w:ascii="Consolas" w:hAnsi="Consolas"/>
+          <w:sz w:val="20"/>
+          <w:lang w:val="ru-RU"/>
+        </w:rPr>
+        <w:t xml:space="preserve">1 + </w:t>
+      </w:r>
+      <w:r>
+        <w:rPr>
+          <w:rFonts w:ascii="Consolas" w:hAnsi="Consolas"/>
+          <w:sz w:val="20"/>
+        </w:rPr>
+        <w:t>m</w:t>
+      </w:r>
+      <w:r>
+        <w:rPr>
+          <w:rFonts w:ascii="Consolas" w:hAnsi="Consolas"/>
+          <w:sz w:val="20"/>
+          <w:lang w:val="ru-RU"/>
+        </w:rPr>
+        <w:t>)</w:t>
       </w:r>
     </w:p>
     <w:p>
       <w:pPr>
-        <w:spacing w:after="40"/>
-        <w:ind w:left="360"/>
-      </w:pPr>
-      <w:r>
-        <w:rPr>
-          <w:rFonts w:ascii="Consolas" w:hAnsi="Consolas"/>
-          <w:sz w:val="20"/>
-        </w:rPr>
-        <w:t>Если max = G', то H = 60 × (((B' - R') / delta) + 2)</w:t>
+        <w:pStyle w:val="21"/>
+        <w:rPr>
+          <w:lang w:val="ru-RU"/>
+        </w:rPr>
+      </w:pPr>
+      <w:r>
+        <w:rPr>
+          <w:lang w:val="ru-RU"/>
+        </w:rPr>
+        <w:t>2.3. Ссылки на формулы и источники</w:t>
       </w:r>
     </w:p>
     <w:p>
       <w:pPr>
-        <w:spacing w:after="40"/>
-        <w:ind w:left="360"/>
-      </w:pPr>
-      <w:r>
-        <w:rPr>
-          <w:rFonts w:ascii="Consolas" w:hAnsi="Consolas"/>
-          <w:sz w:val="20"/>
-        </w:rPr>
-        <w:t>Если max = B', то H = 60 × (((R' - G') / delta) + 4)</w:t>
+        <w:rPr>
+          <w:lang w:val="ru-RU"/>
+        </w:rPr>
+      </w:pPr>
+      <w:r>
+        <w:rPr>
+          <w:lang w:val="ru-RU"/>
+        </w:rPr>
+        <w:t>При реализации преобразований использовались стандартные формулы, приведённые в источниках по цветовым моделям.</w:t>
       </w:r>
     </w:p>
     <w:p>
       <w:pPr>
-        <w:rPr>
-          <w:lang w:val="ru-RU"/>
-        </w:rPr>
-      </w:pPr>
-      <w:r>
-        <w:rPr>
-          <w:lang w:val="ru-RU"/>
-        </w:rPr>
-        <w:t xml:space="preserve">Если </w:t>
-      </w:r>
-      <w:r>
-        <w:t>H</w:t>
-      </w:r>
-      <w:r>
-        <w:rPr>
-          <w:lang w:val="ru-RU"/>
-        </w:rPr>
-        <w:t xml:space="preserve"> оказывается отрицательным, к нему добавляется 360, чтобы значение находилось в диапазоне от 0 до 360.</w:t>
-      </w:r>
-    </w:p>
-    <w:p>
-      <w:pPr>
-        <w:pStyle w:val="31"/>
-        <w:rPr>
-          <w:lang w:val="ru-RU"/>
-        </w:rPr>
-      </w:pPr>
-      <w:r>
-        <w:t>HSV</w:t>
-      </w:r>
-      <w:r>
-        <w:rPr>
-          <w:lang w:val="ru-RU"/>
-        </w:rPr>
-        <w:t xml:space="preserve"> → </w:t>
-      </w:r>
-      <w:r>
-        <w:t>RGB</w:t>
-      </w:r>
-    </w:p>
-    <w:p>
-      <w:pPr>
-        <w:rPr>
-          <w:lang w:val="ru-RU"/>
-        </w:rPr>
-      </w:pPr>
-      <w:r>
-        <w:rPr>
-          <w:lang w:val="ru-RU"/>
-        </w:rPr>
-        <w:t xml:space="preserve">Значения </w:t>
-      </w:r>
-      <w:r>
-        <w:t>S</w:t>
-      </w:r>
-      <w:r>
-        <w:rPr>
-          <w:lang w:val="ru-RU"/>
-        </w:rPr>
-        <w:t xml:space="preserve"> и </w:t>
-      </w:r>
-      <w:r>
-        <w:t>V</w:t>
-      </w:r>
-      <w:r>
-        <w:rPr>
-          <w:lang w:val="ru-RU"/>
-        </w:rPr>
-        <w:t xml:space="preserve"> переводятся из процентов в доли от 0 до 1.</w:t>
-      </w:r>
-    </w:p>
-    <w:p>
-      <w:pPr>
-        <w:spacing w:after="40"/>
-        <w:ind w:left="360"/>
-      </w:pPr>
-      <w:r>
-        <w:rPr>
-          <w:rFonts w:ascii="Consolas" w:hAnsi="Consolas"/>
-          <w:sz w:val="20"/>
-        </w:rPr>
-        <w:t>C = V × S</w:t>
-      </w:r>
-    </w:p>
-    <w:p>
-      <w:pPr>
-        <w:spacing w:after="40"/>
-        <w:ind w:left="360"/>
-      </w:pPr>
-      <w:r>
-        <w:rPr>
-          <w:rFonts w:ascii="Consolas" w:hAnsi="Consolas"/>
-          <w:sz w:val="20"/>
-        </w:rPr>
-        <w:t>X = C × (1 - |((H / 60) mod 2) - 1|)</w:t>
-      </w:r>
-    </w:p>
-    <w:p>
-      <w:pPr>
-        <w:spacing w:after="40"/>
-        <w:ind w:left="360"/>
-      </w:pPr>
-      <w:r>
-        <w:rPr>
-          <w:rFonts w:ascii="Consolas" w:hAnsi="Consolas"/>
-          <w:sz w:val="20"/>
-        </w:rPr>
-        <w:t>m = V - C</w:t>
-      </w:r>
-    </w:p>
-    <w:p>
-      <w:pPr>
-        <w:rPr>
-          <w:lang w:val="ru-RU"/>
-        </w:rPr>
-      </w:pPr>
-      <w:r>
-        <w:rPr>
-          <w:lang w:val="ru-RU"/>
-        </w:rPr>
-        <w:lastRenderedPageBreak/>
-        <w:t xml:space="preserve">В зависимости от значения </w:t>
-      </w:r>
-      <w:r>
-        <w:t>H</w:t>
-      </w:r>
-      <w:r>
-        <w:rPr>
-          <w:lang w:val="ru-RU"/>
-        </w:rPr>
-        <w:t xml:space="preserve"> выбирается один из шести секторов, после чего определяются промежуточные значения </w:t>
-      </w:r>
-      <w:r>
-        <w:t>R</w:t>
-      </w:r>
-      <w:r>
-        <w:rPr>
-          <w:lang w:val="ru-RU"/>
-        </w:rPr>
-        <w:t xml:space="preserve">1, </w:t>
-      </w:r>
-      <w:r>
-        <w:t>G</w:t>
-      </w:r>
-      <w:r>
-        <w:rPr>
-          <w:lang w:val="ru-RU"/>
-        </w:rPr>
-        <w:t xml:space="preserve">1, </w:t>
-      </w:r>
-      <w:r>
-        <w:t>B</w:t>
-      </w:r>
-      <w:r>
-        <w:rPr>
-          <w:lang w:val="ru-RU"/>
-        </w:rPr>
-        <w:t>1.</w:t>
-      </w:r>
-    </w:p>
-    <w:p>
-      <w:pPr>
-        <w:spacing w:after="40"/>
-        <w:ind w:left="360"/>
-        <w:rPr>
-          <w:lang w:val="ru-RU"/>
-        </w:rPr>
-      </w:pPr>
-      <w:r>
-        <w:rPr>
-          <w:rFonts w:ascii="Consolas" w:hAnsi="Consolas"/>
-          <w:sz w:val="20"/>
-        </w:rPr>
-        <w:t>R</w:t>
-      </w:r>
-      <w:r>
-        <w:rPr>
-          <w:rFonts w:ascii="Consolas" w:hAnsi="Consolas"/>
-          <w:sz w:val="20"/>
-          <w:lang w:val="ru-RU"/>
-        </w:rPr>
-        <w:t xml:space="preserve"> = 255 × (</w:t>
-      </w:r>
-      <w:r>
-        <w:rPr>
-          <w:rFonts w:ascii="Consolas" w:hAnsi="Consolas"/>
-          <w:sz w:val="20"/>
-        </w:rPr>
-        <w:t>R</w:t>
-      </w:r>
-      <w:r>
-        <w:rPr>
-          <w:rFonts w:ascii="Consolas" w:hAnsi="Consolas"/>
-          <w:sz w:val="20"/>
-          <w:lang w:val="ru-RU"/>
-        </w:rPr>
-        <w:t xml:space="preserve">1 + </w:t>
-      </w:r>
-      <w:r>
-        <w:rPr>
-          <w:rFonts w:ascii="Consolas" w:hAnsi="Consolas"/>
-          <w:sz w:val="20"/>
-        </w:rPr>
-        <w:t>m</w:t>
-      </w:r>
-      <w:r>
-        <w:rPr>
-          <w:rFonts w:ascii="Consolas" w:hAnsi="Consolas"/>
-          <w:sz w:val="20"/>
-          <w:lang w:val="ru-RU"/>
-        </w:rPr>
-        <w:t>)</w:t>
-      </w:r>
-    </w:p>
-    <w:p>
-      <w:pPr>
-        <w:spacing w:after="40"/>
-        <w:ind w:left="360"/>
-        <w:rPr>
-          <w:lang w:val="ru-RU"/>
-        </w:rPr>
-      </w:pPr>
-      <w:r>
-        <w:rPr>
-          <w:rFonts w:ascii="Consolas" w:hAnsi="Consolas"/>
-          <w:sz w:val="20"/>
-        </w:rPr>
-        <w:t>G</w:t>
-      </w:r>
-      <w:r>
-        <w:rPr>
-          <w:rFonts w:ascii="Consolas" w:hAnsi="Consolas"/>
-          <w:sz w:val="20"/>
-          <w:lang w:val="ru-RU"/>
-        </w:rPr>
-        <w:t xml:space="preserve"> = 255 × (</w:t>
-      </w:r>
-      <w:r>
-        <w:rPr>
-          <w:rFonts w:ascii="Consolas" w:hAnsi="Consolas"/>
-          <w:sz w:val="20"/>
-        </w:rPr>
-        <w:t>G</w:t>
-      </w:r>
-      <w:r>
-        <w:rPr>
-          <w:rFonts w:ascii="Consolas" w:hAnsi="Consolas"/>
-          <w:sz w:val="20"/>
-          <w:lang w:val="ru-RU"/>
-        </w:rPr>
-        <w:t xml:space="preserve">1 + </w:t>
-      </w:r>
-      <w:r>
-        <w:rPr>
-          <w:rFonts w:ascii="Consolas" w:hAnsi="Consolas"/>
-          <w:sz w:val="20"/>
-        </w:rPr>
-        <w:t>m</w:t>
-      </w:r>
-      <w:r>
-        <w:rPr>
-          <w:rFonts w:ascii="Consolas" w:hAnsi="Consolas"/>
-          <w:sz w:val="20"/>
-          <w:lang w:val="ru-RU"/>
-        </w:rPr>
-        <w:t>)</w:t>
-      </w:r>
-    </w:p>
-    <w:p>
-      <w:pPr>
-        <w:spacing w:after="40"/>
-        <w:ind w:left="360"/>
-        <w:rPr>
-          <w:lang w:val="ru-RU"/>
-        </w:rPr>
-      </w:pPr>
-      <w:r>
-        <w:rPr>
-          <w:rFonts w:ascii="Consolas" w:hAnsi="Consolas"/>
-          <w:sz w:val="20"/>
-        </w:rPr>
-        <w:t>B</w:t>
-      </w:r>
-      <w:r>
-        <w:rPr>
-          <w:rFonts w:ascii="Consolas" w:hAnsi="Consolas"/>
-          <w:sz w:val="20"/>
-          <w:lang w:val="ru-RU"/>
-        </w:rPr>
-        <w:t xml:space="preserve"> = 255 × (</w:t>
-      </w:r>
-      <w:r>
-        <w:rPr>
-          <w:rFonts w:ascii="Consolas" w:hAnsi="Consolas"/>
-          <w:sz w:val="20"/>
-        </w:rPr>
-        <w:t>B</w:t>
-      </w:r>
-      <w:r>
-        <w:rPr>
-          <w:rFonts w:ascii="Consolas" w:hAnsi="Consolas"/>
-          <w:sz w:val="20"/>
-          <w:lang w:val="ru-RU"/>
-        </w:rPr>
-        <w:t xml:space="preserve">1 + </w:t>
-      </w:r>
-      <w:r>
-        <w:rPr>
-          <w:rFonts w:ascii="Consolas" w:hAnsi="Consolas"/>
-          <w:sz w:val="20"/>
-        </w:rPr>
-        <w:t>m</w:t>
-      </w:r>
-      <w:r>
-        <w:rPr>
-          <w:rFonts w:ascii="Consolas" w:hAnsi="Consolas"/>
-          <w:sz w:val="20"/>
-          <w:lang w:val="ru-RU"/>
-        </w:rPr>
-        <w:t>)</w:t>
-      </w:r>
-    </w:p>
-    <w:p>
-      <w:pPr>
-        <w:pStyle w:val="21"/>
-        <w:rPr>
-          <w:lang w:val="ru-RU"/>
-        </w:rPr>
-      </w:pPr>
-      <w:r>
-        <w:rPr>
-          <w:lang w:val="ru-RU"/>
-        </w:rPr>
-        <w:t>2.3. Ссылки на формулы и источники</w:t>
-      </w:r>
-    </w:p>
-    <w:p>
-      <w:pPr>
-        <w:rPr>
-          <w:lang w:val="ru-RU"/>
-        </w:rPr>
-      </w:pPr>
-      <w:r>
-        <w:rPr>
-          <w:lang w:val="ru-RU"/>
-        </w:rPr>
-        <w:t>При реализации преобразований использовались стандартные формулы, приведённые в источниках по цветовым моделям.</w:t>
-      </w:r>
-    </w:p>
-    <w:p>
-      <w:pPr>
         <w:pStyle w:val="a0"/>
         <w:rPr>
           <w:lang w:val="ru-RU"/>
         </w:rPr>
       </w:pPr>
-      <w:hyperlink r:id="rId6" w:history="1">
+      <w:hyperlink r:id="rId7" w:history="1">
         <w:r>
           <w:rPr>
             <w:rStyle w:val="aff8"/>
@@ -1939,7 +2023,7 @@
           <w:lang w:val="ru-RU"/>
         </w:rPr>
       </w:pPr>
-      <w:hyperlink r:id="rId7" w:history="1">
+      <w:hyperlink r:id="rId8" w:history="1">
         <w:r>
           <w:rPr>
             <w:rStyle w:val="aff8"/>
@@ -2020,7 +2104,7 @@
           <w:lang w:val="ru-RU"/>
         </w:rPr>
       </w:pPr>
-      <w:hyperlink r:id="rId8" w:history="1">
+      <w:hyperlink r:id="rId9" w:history="1">
         <w:r>
           <w:rPr>
             <w:rStyle w:val="aff8"/>
@@ -2538,6 +2622,7 @@
           </w:tcPr>
           <w:p>
             <w:r>
+              <w:lastRenderedPageBreak/>
               <w:t>Зелёный</w:t>
             </w:r>
           </w:p>
@@ -2622,7 +2707,6 @@
           </w:tcPr>
           <w:p>
             <w:r>
-              <w:lastRenderedPageBreak/>
               <w:t>Белый</w:t>
             </w:r>
           </w:p>
@@ -3181,7 +3265,14 @@
         <w:rPr>
           <w:lang w:val="ru-RU"/>
         </w:rPr>
-        <w:t xml:space="preserve">. Однако обратное преобразование из чёрного </w:t>
+        <w:t xml:space="preserve">. Однако обратное преобразование </w:t>
+      </w:r>
+      <w:r>
+        <w:rPr>
+          <w:lang w:val="ru-RU"/>
+        </w:rPr>
+        <w:lastRenderedPageBreak/>
+        <w:t xml:space="preserve">из чёрного </w:t>
       </w:r>
       <w:r>
         <w:t>RGB</w:t>
@@ -3240,7 +3331,6 @@
         <w:rPr>
           <w:lang w:val="ru-RU"/>
         </w:rPr>
-        <w:lastRenderedPageBreak/>
         <w:t>4. Заключение</w:t>
       </w:r>
     </w:p>

</xml_diff>